<commit_message>
feat: prove source-portable formula copy (#4)
</commit_message>
<xml_diff>
--- a/corpus/phase0/word/minimal-document.docx
+++ b/corpus/phase0/word/minimal-document.docx
@@ -1,11 +1,44 @@
 
 <file path=word/document.xml><?xml version="1.0" encoding="utf-8"?>
-<w:document xmlns:w="http://schemas.openxmlformats.org/wordprocessingml/2006/main">
+<w:document xmlns:m="http://schemas.openxmlformats.org/officeDocument/2006/math" xmlns:w="http://schemas.openxmlformats.org/wordprocessingml/2006/main">
   <w:body>
     <w:p>
       <w:r>
         <w:t>FormulaBridge Phase 0 synthetic corpus</w:t>
       </w:r>
+    </w:p>
+    <w:p>
+      <w:sdt>
+        <w:sdtPr>
+          <w:alias w:val="FormulaBridge Formula"/>
+          <w:tag w:val="FormulaBridge.Formula:11111111-1111-4111-8111-111111111111"/>
+          <w:id w:val="1001"/>
+        </w:sdtPr>
+        <w:sdtContent>
+          <m:oMath>
+            <m:r>
+              <m:t>x² + y² = z²</m:t>
+            </m:r>
+          </m:oMath>
+          <w:sdt>
+            <w:sdtPr>
+              <w:alias w:val="FormulaBridge Copy Carrier"/>
+              <w:tag w:val="FormulaBridge.CopyCarrier:v1"/>
+              <w:id w:val="1002"/>
+              <w:text/>
+            </w:sdtPr>
+            <w:sdtContent>
+              <w:r>
+                <w:rPr>
+                  <w:vanish/>
+                  <w:specVanish/>
+                </w:rPr>
+                <w:t>eyJzY2hlbWFWZXJzaW9uIjoxLCJmb3JtdWxhSWQiOiIxMTExMTExMS0xMTExLTQxMTEtODExMS0xMTExMTExMTExMTEiLCJsYWJlbCI6ImVxOnF1YWRyYXRpYyIsImxhdGV4IjoieF4yICsgeV4yID0gel4yIiwiY2hlY2tzdW0iOiI4MGMyYzQ4ZGY3M2FiYzk5ODY1NGQwOWVhMmRhNDc4ZDBlZDIwZWJjOWJjMmJhY2U2MTIxYWJiNDFmYTM0NjNmIn0=</w:t>
+              </w:r>
+            </w:sdtContent>
+          </w:sdt>
+        </w:sdtContent>
+      </w:sdt>
     </w:p>
     <w:sectPr>
       <w:pgSz w:w="12240" w:h="15840"/>
@@ -13,4 +46,20 @@
     </w:sectPr>
   </w:body>
 </w:document>
+</file>
+
+<file path=customXml/item1.xml><?xml version="1.0" encoding="utf-8"?>
+<fb:formulas xmlns:fb="urn:formulabridge:formula-metadata:v1" schemaVersion="1">
+  <fb:formula id="11111111-1111-4111-8111-111111111111" label="eq:quadratic" checksum="80c2c48df73abc998654d09ea2da478d0ed20ebc9bc2bace6121abb41fa3463f">
+    <fb:latex>x^2 + y^2 = z^2</fb:latex>
+  </fb:formula>
+</fb:formulas>
+</file>
+
+<file path=customXml/itemProps1.xml><?xml version="1.0" encoding="utf-8"?>
+<ds:datastoreItem xmlns:ds="http://schemas.openxmlformats.org/officeDocument/2006/customXml" ds:itemID="{11111111-2222-4333-8444-555555555555}">
+  <ds:schemaRefs>
+    <ds:schemaRef ds:uri="urn:formulabridge:formula-metadata:v1"/>
+  </ds:schemaRefs>
+</ds:datastoreItem>
 </file>
</xml_diff>